<commit_message>
1 Euro Auctions v2: refusi dell'IT corretti, difetti della v1 corretti in FR PT PL RU, Word con le osservazioni per lo studio (17 punti), glossari aggiornati, report
Co-Authored-By: Claude Opus 5.5 <noreply@anthropic.com>
Claude-Session: https://claude.ai/code/session_01Fft5ex4c8NSfwonzhN2ZEF
</commit_message>
<xml_diff>
--- a/T&C/1 Euro Auctions/Vers 2 - Multilanguage - Q4 2026/2_CPA_1EuroAuction_Versione_2_2026_DEF_FRA.docx
+++ b/T&C/1 Euro Auctions/Vers 2 - Multilanguage - Q4 2026/2_CPA_1EuroAuction_Versione_2_2026_DEF_FRA.docx
@@ -182,7 +182,7 @@
           <w:sz w:val="20"/>
           <w:szCs w:val="20"/>
         </w:rPr>
-        <w:t>Pour tout ce qui n’est pas expressément prévu dans le présent document, les CG, les éventuelles Conditions particulières et le Tarif Fleequid demeurent intégralement applicables, dans la mesure où ils sont compatibles avec la nature des « 1 Euro Auctions », selon la hiérarchie établie par l’art. 3.3 des CG.</w:t>
+        <w:t>Pour tout ce qui n’est pas expressément prévu dans le présent document, les CG, les éventuelles Conditions spécifiques et le Tarif Fleequid demeurent intégralement applicables, dans la mesure où ils sont compatibles avec la nature des « 1 Euro Auctions », selon la hiérarchie établie par l’art. 3.3 des CG.</w:t>
       </w:r>
       <w:proofErr w:type="spellStart"/>
       <w:proofErr w:type="spellEnd"/>
@@ -329,7 +329,7 @@
           <w:sz w:val="20"/>
           <w:szCs w:val="20"/>
         </w:rPr>
-        <w:t>Dans les 1 Euro Auctions, le mécanisme ordinaire de détermination du Prix de réserve (PR) fondé sur le Prix minimum d’engagement à la vente (MCSP) ne s’applique pas. Le MCSP continue toutefois à constituer la valeur économique minimale de référence du Vendeur au sens des Conditions Générales, mais il n’est pas utilisé aux fins de la détermination d’un Prix de réserve dans le cadre des 1 Euro Auctions, la protection économique du Vendeur demeurant régie, dans la Vente en commission, selon les modalités spécifiquement prévues par les présentes Conditions Particulières.</w:t>
+        <w:t>Dans les 1 Euro Auctions, le mécanisme ordinaire de détermination du Prix de réserve (PR) fondé sur le Prix minimum d’engagement à la vente (PMIV) ne s’applique pas. Le PMIV continue toutefois à constituer la valeur économique minimale de référence du Vendeur au sens des Conditions Générales, mais il n’est pas utilisé aux fins de la détermination d’un Prix de réserve dans le cadre des 1 Euro Auctions, la protection économique du Vendeur demeurant régie, dans la Vente en commission, selon les modalités spécifiquement prévues par les présentes Conditions Particulières.</w:t>
       </w:r>
     </w:p>
     <w:p>
@@ -625,32 +625,32 @@
           <w:sz w:val="20"/>
           <w:szCs w:val="20"/>
         </w:rPr>
-        <w:t>Dans le cadre des 1 Euro Auctions exécutées selon le Modèle de Vente en commission, et par dérogation au mécanisme du Prix de réserve (PR) prévu par les Conditions Générales, Fleequid garantit au Vendeur, en présence d’au moins une Offre valide, un encaissement net, égal au Prix de vente à l’Acheteur, déduction faite des seules Commissions à la charge du Vendeur, non inférieur au Prix minimum d’engagement à la vente (MCSP) indiqué pour le Véhicule au sens des CG.</w:t>
-      </w:r>
-    </w:p>
-    <w:p>
-      <w:pPr>
-        <w:pStyle w:val="Paragrafoelenco"/>
-        <w:numPr>
-          <w:ilvl w:val="1"/>
-          <w:numId w:val="1"/>
-        </w:numPr>
-        <w:spacing w:line="360" w:lineRule="auto"/>
-        <w:ind w:left="0" w:firstLine="0"/>
-        <w:jc w:val="both"/>
-        <w:rPr>
-          <w:rFonts w:ascii="Verdana" w:hAnsi="Verdana"/>
-          <w:sz w:val="20"/>
-          <w:szCs w:val="20"/>
-        </w:rPr>
-      </w:pPr>
-      <w:r>
-        <w:rPr>
-          <w:rFonts w:ascii="Verdana" w:hAnsi="Verdana"/>
-          <w:sz w:val="20"/>
-          <w:szCs w:val="20"/>
-        </w:rPr>
-        <w:t>Si l’encaissement net visé à l’art. 3.1 résultant à la fin de la 1 Euro Auction est inférieur au MCSP, Fleequid s’engage à verser au Vendeur la différence nécessaire afin que l’encaissement net revenant au Vendeur, déterminé au sens de l’art. 3.1, soit égal au MCSP. Si, en revanche, l’encaissement net est égal ou supérieur au MCSP, le Vendeur aura droit intégralement à l’encaissement majoré correspondant, selon la discipline ordinaire des CG. L’éventuelle intégration économique a une nature purement compensatoire et ne constitue, en aucune manière, une acquisition directe ou indirecte du Véhicule par Fleequid. La garantie ne couvre pas les Tarifs, les pénalités, les remboursements de frais ni les autres montants éventuellement dus par le Vendeur à Fleequid, qui demeurent régis par les CG, par le Tarif Fleequid et par les autres sources contractuelles applicables et peuvent être déduits ou compensés selon la discipline générale.</w:t>
+        <w:t>Dans le cadre des 1 Euro Auctions exécutées selon le Modèle de Vente en commission, et par dérogation au mécanisme du Prix de réserve (PR) prévu par les Conditions Générales, Fleequid garantit au Vendeur, en présence d’au moins une Offre valide, un encaissement net, égal au Prix de vente à l’Acheteur, déduction faite des seules Commissions à la charge du Vendeur, non inférieur au Prix minimum d’engagement à la vente (PMIV) indiqué pour le Véhicule au sens des CG.</w:t>
+      </w:r>
+    </w:p>
+    <w:p>
+      <w:pPr>
+        <w:pStyle w:val="Paragrafoelenco"/>
+        <w:numPr>
+          <w:ilvl w:val="1"/>
+          <w:numId w:val="1"/>
+        </w:numPr>
+        <w:spacing w:line="360" w:lineRule="auto"/>
+        <w:ind w:left="0" w:firstLine="0"/>
+        <w:jc w:val="both"/>
+        <w:rPr>
+          <w:rFonts w:ascii="Verdana" w:hAnsi="Verdana"/>
+          <w:sz w:val="20"/>
+          <w:szCs w:val="20"/>
+        </w:rPr>
+      </w:pPr>
+      <w:r>
+        <w:rPr>
+          <w:rFonts w:ascii="Verdana" w:hAnsi="Verdana"/>
+          <w:sz w:val="20"/>
+          <w:szCs w:val="20"/>
+        </w:rPr>
+        <w:t>Si l’encaissement net visé à l’art. 3.1 résultant à la fin de la 1 Euro Auction est inférieur au PMIV, Fleequid s’engage à verser au Vendeur la différence nécessaire afin que l’encaissement net revenant au Vendeur, déterminé au sens de l’art. 3.1, soit égal au PMIV. Si, en revanche, l’encaissement net est égal ou supérieur au PMIV, le Vendeur aura droit intégralement à l’encaissement majoré correspondant, selon la discipline ordinaire des CG. L’éventuelle intégration économique a une nature purement compensatoire et ne constitue, en aucune manière, une acquisition directe ou indirecte du Véhicule par Fleequid. La garantie ne couvre pas les Tarifs, les pénalités, les remboursements de frais ni les autres montants éventuellement dus par le Vendeur à Fleequid, qui demeurent régis par les CG, par le Tarif Fleequid et par les autres sources contractuelles applicables et peuvent être déduits ou compensés selon la discipline générale.</w:t>
       </w:r>
     </w:p>
     <w:p>
@@ -727,7 +727,7 @@
           <w:sz w:val="20"/>
           <w:szCs w:val="20"/>
         </w:rPr>
-        <w:t>Le versement de l’éventuelle intégration économique jusqu’au MCSP est subordonné à la conclusion régulière du Contrat et à l’exécution intégrale et définitive des obligations de paiement par l’Acheteur, conformément aux CG. Il est également entendu que le Vendeur devra avoir exécuté intégralement et sans réserve toutes les obligations prévues par les CG et par les présentes Conditions Particulières, y compris, à titre d’exemple, les obligations relatives à la conformité du Véhicule, à l’exhaustivité et à la véracité des informations fournies et à la bonne exécution de la livraison.</w:t>
+        <w:t>Le versement de l’éventuelle intégration économique jusqu’au PMIV est subordonné à la conclusion régulière du Contrat et à l’exécution intégrale et définitive des obligations de paiement par l’Acheteur, conformément aux CG. Il est également entendu que le Vendeur devra avoir exécuté intégralement et sans réserve toutes les obligations prévues par les CG et par les présentes Conditions Particulières, y compris, à titre d’exemple, les obligations relatives à la conformité du Véhicule, à l’exhaustivité et à la véracité des informations fournies et à la bonne exécution de la livraison.</w:t>
       </w:r>
     </w:p>
     <w:p>

</xml_diff>